<commit_message>
S5 L2: manta «do sofá» na atividade e no quiz
Igual à etiqueta 3 e à narração da visita 3D. Guião, .docx e .pdf.

Co-Authored-By: Claude Opus 5.5 <noreply@anthropic.com>
</commit_message>
<xml_diff>
--- a/Files/P1/L2/S5_Prototipo_L2_Grupo1.docx
+++ b/Files/P1/L2/S5_Prototipo_L2_Grupo1.docx
@@ -7032,7 +7032,25 @@
           <w:sz w:val="21"/>
           <w:szCs w:val="21"/>
         </w:rPr>
-        <w:t>7. Uma muda de roupa e calçado confortável · 8. Um objeto novo, para a distrair · 9. Óculos de reserva · 10. O álbum de fotografias da família · 11. A manta da cadeira da sala · 12. Uma cópia da ficha da pessoa</w:t>
+        <w:t xml:space="preserve">7. Uma muda de roupa e calçado confortável · 8. Um objeto novo, para a distrair · 9. Óculos de reserva · 10. O álbum de fotografias da família · 11. </w:t>
+      </w:r>
+      <w:r>
+        <w:rPr>
+          <w:rFonts w:ascii="Segoe UI" w:hAnsi="Segoe UI" w:cs="Segoe UI"/>
+          <w:color w:val="2B2B2B"/>
+          <w:sz w:val="21"/>
+          <w:szCs w:val="21"/>
+        </w:rPr>
+        <w:t>A manta do sofá da sala</w:t>
+      </w:r>
+      <w:r>
+        <w:rPr>
+          <w:rFonts w:ascii="Segoe UI" w:hAnsi="Segoe UI" w:cs="Segoe UI"/>
+          <w:color w:val="2B2B2B"/>
+          <w:sz w:val="21"/>
+          <w:szCs w:val="21"/>
+        </w:rPr>
+        <w:t xml:space="preserve"> · 12. Uma cópia da ficha da pessoa</w:t>
       </w:r>
     </w:p>
     <w:p>
@@ -7677,7 +7695,6 @@
                 <w:sz w:val="19"/>
                 <w:szCs w:val="19"/>
               </w:rPr>
-              <w:lastRenderedPageBreak/>
               <w:t>P2 · Objetos de conforto</w:t>
             </w:r>
           </w:p>
@@ -7716,7 +7733,25 @@
                 <w:sz w:val="19"/>
                 <w:szCs w:val="19"/>
               </w:rPr>
-              <w:t>B · A manta que a mãe usa na cadeira e a música de que gosta.</w:t>
+              <w:t xml:space="preserve">B · </w:t>
+            </w:r>
+            <w:r>
+              <w:rPr>
+                <w:rFonts w:ascii="Segoe UI" w:eastAsia="Times New Roman" w:hAnsi="Segoe UI" w:cs="Segoe UI"/>
+                <w:color w:val="2B2B2B"/>
+                <w:sz w:val="19"/>
+                <w:szCs w:val="19"/>
+              </w:rPr>
+              <w:t>A manta que a mãe usa no sofá</w:t>
+            </w:r>
+            <w:r>
+              <w:rPr>
+                <w:rFonts w:ascii="Segoe UI" w:eastAsia="Times New Roman" w:hAnsi="Segoe UI" w:cs="Segoe UI"/>
+                <w:color w:val="2B2B2B"/>
+                <w:sz w:val="19"/>
+                <w:szCs w:val="19"/>
+              </w:rPr>
+              <w:t xml:space="preserve"> e a música de que gosta.</w:t>
             </w:r>
           </w:p>
         </w:tc>
@@ -8055,7 +8090,7 @@
                 <w:szCs w:val="17"/>
               </w:rPr>
               <w:drawing>
-                <wp:inline distT="0" distB="0" distL="0" distR="0" wp14:anchorId="438C19AC" wp14:editId="0B1000A1">
+                <wp:inline distT="0" distB="0" distL="0" distR="0" wp14:anchorId="438C19AC" wp14:editId="0754FD2C">
                   <wp:extent cx="4191000" cy="2073048"/>
                   <wp:effectExtent l="0" t="0" r="0" b="3810"/>
                   <wp:docPr id="20" name="Picture 20"/>
@@ -8125,7 +8160,6 @@
         <w:rPr>
           <w:rFonts w:ascii="Segoe UI" w:eastAsia="Times New Roman" w:hAnsi="Segoe UI" w:cs="Segoe UI"/>
         </w:rPr>
-        <w:lastRenderedPageBreak/>
         <w:t>6. Coerência com as outras lições</w:t>
       </w:r>
     </w:p>
@@ -8441,7 +8475,6 @@
         <w:rPr>
           <w:rFonts w:ascii="Segoe UI" w:eastAsia="Times New Roman" w:hAnsi="Segoe UI" w:cs="Segoe UI"/>
         </w:rPr>
-        <w:lastRenderedPageBreak/>
         <w:t>7. Próximos passos (S6, 03/11)</w:t>
       </w:r>
     </w:p>

</xml_diff>